<commit_message>
Salvar atualizacoes dos projetos ENAJU
</commit_message>
<xml_diff>
--- a/Projetos/lacunas-capacitacao-cnj/outputs/resumo_executivo.docx
+++ b/Projetos/lacunas-capacitacao-cnj/outputs/resumo_executivo.docx
@@ -2,13 +2,13 @@
 <file path=word/document.xml><?xml version="1.0" encoding="utf-8"?>
 <w:document xmlns:w="http://schemas.openxmlformats.org/wordprocessingml/2006/main" xmlns:m="http://schemas.openxmlformats.org/officeDocument/2006/math" xmlns:r="http://schemas.openxmlformats.org/officeDocument/2006/relationships" xmlns:o="urn:schemas-microsoft-com:office:office" xmlns:v="urn:schemas-microsoft-com:vml" xmlns:w10="urn:schemas-microsoft-com:office:word" xmlns:a="http://schemas.openxmlformats.org/drawingml/2006/main" xmlns:pic="http://schemas.openxmlformats.org/drawingml/2006/picture" xmlns:wp="http://schemas.openxmlformats.org/drawingml/2006/wordprocessingDrawing">
   <w:body>
-    <w:bookmarkStart w:id="15" w:name="Xaf8bdda862ba8ef2c290444e66a3b1fd75afd5c"/>
+    <w:bookmarkStart w:id="15" w:name="X35c13585334ee15de75f5699c7f54aadffcbeb4"/>
     <w:p>
       <w:pPr>
         <w:pStyle w:val="Heading1"/>
       </w:pPr>
       <w:r>
-        <w:t xml:space="preserve">Sintese Executiva - Lacunas de Capacitacao em Producoes do CNJ</w:t>
+        <w:t xml:space="preserve">Síntese Executiva - Lacunas de Capacitação em Produções do CNJ</w:t>
       </w:r>
     </w:p>
     <w:bookmarkStart w:id="9" w:name="status"/>
@@ -29,7 +29,7 @@
           <w:b/>
           <w:bCs/>
         </w:rPr>
-        <w:t xml:space="preserve">PROPOSTA TECNICA - priorizacao automatizada com amostra de calibracao estruturada</w:t>
+        <w:t xml:space="preserve">PROPOSTA TÉCNICA - priorização automatizada com amostra de calibração estruturada</w:t>
       </w:r>
     </w:p>
     <w:bookmarkEnd w:id="9"/>
@@ -62,7 +62,7 @@
         <w:t xml:space="preserve"> </w:t>
       </w:r>
       <w:r>
-        <w:t xml:space="preserve">usa a fotografia editorial do portal de Pesquisas Judiciarias do CNJ em</w:t>
+        <w:t xml:space="preserve">usa a fotografia editorial do portal de Pesquisas Judiciárias do CNJ em</w:t>
       </w:r>
       <w:r>
         <w:t xml:space="preserve"> </w:t>
@@ -74,7 +74,7 @@
         <w:t xml:space="preserve">2026-05-31</w:t>
       </w:r>
       <w:r>
-        <w:t xml:space="preserve">. O corpus processado contem</w:t>
+        <w:t xml:space="preserve">. O corpus processado contém</w:t>
       </w:r>
       <w:r>
         <w:t xml:space="preserve"> </w:t>
@@ -89,7 +89,7 @@
         <w:t xml:space="preserve"> </w:t>
       </w:r>
       <w:r>
-        <w:t xml:space="preserve">documentos e 3100 evidencias unicas em 5034 linhas evidencia-eixo consideradas.</w:t>
+        <w:t xml:space="preserve">documentos e 3100 evidências únicas em 5034 linhas evidência-eixo consideradas.</w:t>
       </w:r>
     </w:p>
     <w:bookmarkEnd w:id="10"/>
@@ -111,7 +111,7 @@
         </w:numPr>
       </w:pPr>
       <w:r>
-        <w:t xml:space="preserve">Capacitacao em dados, tecnologia e inteligencia institucional: score final</w:t>
+        <w:t xml:space="preserve">Capacitação em dados, tecnologia e inteligência institucional: score final</w:t>
       </w:r>
       <w:r>
         <w:t xml:space="preserve"> </w:t>
@@ -135,7 +135,7 @@
         <w:t xml:space="preserve">media</w:t>
       </w:r>
       <w:r>
-        <w:t xml:space="preserve">, 1029 evidencias em 46 documentos.</w:t>
+        <w:t xml:space="preserve">, 1029 evidências em 46 documentos.</w:t>
       </w:r>
     </w:p>
     <w:p>
@@ -147,7 +147,7 @@
         </w:numPr>
       </w:pPr>
       <w:r>
-        <w:t xml:space="preserve">Capacitacao em direitos humanos, inclusao e acessibilidade: score final</w:t>
+        <w:t xml:space="preserve">Capacitação em direitos humanos, inclusão e acessibilidade: score final</w:t>
       </w:r>
       <w:r>
         <w:t xml:space="preserve"> </w:t>
@@ -171,7 +171,7 @@
         <w:t xml:space="preserve">media</w:t>
       </w:r>
       <w:r>
-        <w:t xml:space="preserve">, 848 evidencias em 48 documentos.</w:t>
+        <w:t xml:space="preserve">, 848 evidências em 48 documentos.</w:t>
       </w:r>
     </w:p>
     <w:p>
@@ -183,7 +183,7 @@
         </w:numPr>
       </w:pPr>
       <w:r>
-        <w:t xml:space="preserve">Capacitacao em comunicacao e acessibilidade: score final</w:t>
+        <w:t xml:space="preserve">Capacitação em comunicação e acessibilidade: score final</w:t>
       </w:r>
       <w:r>
         <w:t xml:space="preserve"> </w:t>
@@ -207,7 +207,7 @@
         <w:t xml:space="preserve">media</w:t>
       </w:r>
       <w:r>
-        <w:t xml:space="preserve">, 320 evidencias em 42 documentos.</w:t>
+        <w:t xml:space="preserve">, 320 evidências em 42 documentos.</w:t>
       </w:r>
     </w:p>
     <w:p>
@@ -219,7 +219,7 @@
         </w:numPr>
       </w:pPr>
       <w:r>
-        <w:t xml:space="preserve">Trilha de avaliacao, monitoramento e planejamento estrategico: score final</w:t>
+        <w:t xml:space="preserve">Trilha de avaliação, monitoramento e planejamento estratégico: score final</w:t>
       </w:r>
       <w:r>
         <w:t xml:space="preserve"> </w:t>
@@ -243,7 +243,7 @@
         <w:t xml:space="preserve">media</w:t>
       </w:r>
       <w:r>
-        <w:t xml:space="preserve">, 699 evidencias em 44 documentos.</w:t>
+        <w:t xml:space="preserve">, 699 evidências em 44 documentos.</w:t>
       </w:r>
     </w:p>
     <w:p>
@@ -255,7 +255,7 @@
         </w:numPr>
       </w:pPr>
       <w:r>
-        <w:t xml:space="preserve">Trilha de gestao, governanca e lideranca: score final</w:t>
+        <w:t xml:space="preserve">Trilha de gestão, governança e liderança: score final</w:t>
       </w:r>
       <w:r>
         <w:t xml:space="preserve"> </w:t>
@@ -279,7 +279,7 @@
         <w:t xml:space="preserve">media</w:t>
       </w:r>
       <w:r>
-        <w:t xml:space="preserve">, 394 evidencias em 51 documentos.</w:t>
+        <w:t xml:space="preserve">, 394 evidências em 51 documentos.</w:t>
       </w:r>
     </w:p>
     <w:p>
@@ -291,7 +291,7 @@
         </w:numPr>
       </w:pPr>
       <w:r>
-        <w:t xml:space="preserve">Trilha de atendimento e servicos ao cidadao: score final</w:t>
+        <w:t xml:space="preserve">Trilha de atendimento e serviços ao cidadão: score final</w:t>
       </w:r>
       <w:r>
         <w:t xml:space="preserve"> </w:t>
@@ -315,7 +315,7 @@
         <w:t xml:space="preserve">media</w:t>
       </w:r>
       <w:r>
-        <w:t xml:space="preserve">, 435 evidencias em 45 documentos.</w:t>
+        <w:t xml:space="preserve">, 435 evidências em 45 documentos.</w:t>
       </w:r>
     </w:p>
     <w:p>
@@ -327,7 +327,7 @@
         </w:numPr>
       </w:pPr>
       <w:r>
-        <w:t xml:space="preserve">Trilha de inovacao e transformacao digital: score final</w:t>
+        <w:t xml:space="preserve">Trilha de inovação e transformação digital: score final</w:t>
       </w:r>
       <w:r>
         <w:t xml:space="preserve"> </w:t>
@@ -351,7 +351,7 @@
         <w:t xml:space="preserve">media</w:t>
       </w:r>
       <w:r>
-        <w:t xml:space="preserve">, 484 evidencias em 27 documentos.</w:t>
+        <w:t xml:space="preserve">, 484 evidências em 27 documentos.</w:t>
       </w:r>
     </w:p>
     <w:p>
@@ -363,7 +363,7 @@
         </w:numPr>
       </w:pPr>
       <w:r>
-        <w:t xml:space="preserve">Capacitacao em saude e bem-estar institucional: score final</w:t>
+        <w:t xml:space="preserve">Capacitação em saúde e bem-estar institucional: score final</w:t>
       </w:r>
       <w:r>
         <w:t xml:space="preserve"> </w:t>
@@ -387,7 +387,7 @@
         <w:t xml:space="preserve">baixa</w:t>
       </w:r>
       <w:r>
-        <w:t xml:space="preserve">, 214 evidencias em 31 documentos.</w:t>
+        <w:t xml:space="preserve">, 214 evidências em 31 documentos.</w:t>
       </w:r>
     </w:p>
     <w:bookmarkEnd w:id="11"/>
@@ -415,7 +415,7 @@
         <w:t xml:space="preserve">direitos_humanos_e_inclusao</w:t>
       </w:r>
       <w:r>
-        <w:t xml:space="preserve">: 675 evidencias em 26 documentos (Producao Interna)</w:t>
+        <w:t xml:space="preserve">: 675 evidências em 26 documentos (Producao Interna)</w:t>
       </w:r>
     </w:p>
     <w:p>
@@ -433,7 +433,7 @@
         <w:t xml:space="preserve">dados_e_tecnologia</w:t>
       </w:r>
       <w:r>
-        <w:t xml:space="preserve">: 597 evidencias em 25 documentos (Producao Interna)</w:t>
+        <w:t xml:space="preserve">: 597 evidências em 25 documentos (Producao Interna)</w:t>
       </w:r>
     </w:p>
     <w:p>
@@ -451,7 +451,7 @@
         <w:t xml:space="preserve">avaliacao_e_monitoramento</w:t>
       </w:r>
       <w:r>
-        <w:t xml:space="preserve">: 491 evidencias em 20 documentos (Producao Interna)</w:t>
+        <w:t xml:space="preserve">: 491 evidências em 20 documentos (Producao Interna)</w:t>
       </w:r>
     </w:p>
     <w:p>
@@ -469,7 +469,7 @@
         <w:t xml:space="preserve">dados_e_tecnologia</w:t>
       </w:r>
       <w:r>
-        <w:t xml:space="preserve">: 394 evidencias em 7 documentos (Parcerias Institucionais)</w:t>
+        <w:t xml:space="preserve">: 394 evidências em 7 documentos (Parcerias Institucionais)</w:t>
       </w:r>
     </w:p>
     <w:p>
@@ -487,7 +487,7 @@
         <w:t xml:space="preserve">inovacao_e_transformacao</w:t>
       </w:r>
       <w:r>
-        <w:t xml:space="preserve">: 381 evidencias em 6 documentos (Parcerias Institucionais)</w:t>
+        <w:t xml:space="preserve">: 381 evidências em 6 documentos (Parcerias Institucionais)</w:t>
       </w:r>
     </w:p>
     <w:p>
@@ -505,7 +505,7 @@
         <w:t xml:space="preserve">atendimento_e_servicos_judiciarios</w:t>
       </w:r>
       <w:r>
-        <w:t xml:space="preserve">: 282 evidencias em 25 documentos (Producao Interna)</w:t>
+        <w:t xml:space="preserve">: 282 evidências em 25 documentos (Producao Interna)</w:t>
       </w:r>
     </w:p>
     <w:p>
@@ -523,7 +523,7 @@
         <w:t xml:space="preserve">nao_classificado</w:t>
       </w:r>
       <w:r>
-        <w:t xml:space="preserve">: 256 evidencias em 20 documentos (Producao Interna)</w:t>
+        <w:t xml:space="preserve">: 256 evidências em 20 documentos (Producao Interna)</w:t>
       </w:r>
     </w:p>
     <w:p>
@@ -541,7 +541,7 @@
         <w:t xml:space="preserve">gestao_e_governanca</w:t>
       </w:r>
       <w:r>
-        <w:t xml:space="preserve">: 178 evidencias em 22 documentos (Producao Interna)</w:t>
+        <w:t xml:space="preserve">: 178 evidências em 22 documentos (Producao Interna)</w:t>
       </w:r>
     </w:p>
     <w:p>
@@ -559,7 +559,7 @@
         <w:t xml:space="preserve">comunicacao_e_acessibilidade</w:t>
       </w:r>
       <w:r>
-        <w:t xml:space="preserve">: 161 evidencias em 7 documentos (Parcerias Institucionais)</w:t>
+        <w:t xml:space="preserve">: 161 evidências em 7 documentos (Parcerias Institucionais)</w:t>
       </w:r>
     </w:p>
     <w:p>
@@ -577,7 +577,7 @@
         <w:t xml:space="preserve">direitos_humanos_e_inclusao</w:t>
       </w:r>
       <w:r>
-        <w:t xml:space="preserve">: 155 evidencias em 7 documentos (Parcerias Institucionais)</w:t>
+        <w:t xml:space="preserve">: 155 evidências em 7 documentos (Parcerias Institucionais)</w:t>
       </w:r>
     </w:p>
     <w:p>
@@ -595,7 +595,7 @@
         <w:t xml:space="preserve">gestao_e_governanca</w:t>
       </w:r>
       <w:r>
-        <w:t xml:space="preserve">: 141 evidencias em 7 documentos (Parcerias Institucionais)</w:t>
+        <w:t xml:space="preserve">: 141 evidências em 7 documentos (Parcerias Institucionais)</w:t>
       </w:r>
     </w:p>
     <w:p>
@@ -613,7 +613,7 @@
         <w:t xml:space="preserve">avaliacao_e_monitoramento</w:t>
       </w:r>
       <w:r>
-        <w:t xml:space="preserve">: 139 evidencias em 7 documentos (Parcerias Institucionais)</w:t>
+        <w:t xml:space="preserve">: 139 evidências em 7 documentos (Parcerias Institucionais)</w:t>
       </w:r>
     </w:p>
     <w:bookmarkEnd w:id="12"/>
@@ -631,7 +631,7 @@
         <w:pStyle w:val="FirstParagraph"/>
       </w:pPr>
       <w:r>
-        <w:t xml:space="preserve">Este documento e uma proposta tecnica baseada em evidencias automatizadas, matriz de priorizacao e calibracao amostral quando importada. Ele apoia decisao pedagogica e planejamento, mas nao substitui validacao institucional final.</w:t>
+        <w:t xml:space="preserve">Este documento é uma proposta técnica baseada em evidências automatizadas, matriz de priorização e calibração amostral quando importada. Ele apoia decisão pedagógica e planejamento, mas não substitui validação institucional final.</w:t>
       </w:r>
     </w:p>
     <w:bookmarkEnd w:id="13"/>
@@ -653,7 +653,7 @@
         </w:numPr>
       </w:pPr>
       <w:r>
-        <w:t xml:space="preserve">o corpus representa o portal e a data de corte, nao todo o Poder Judiciario;</w:t>
+        <w:t xml:space="preserve">o corpus representa o portal e a data de corte, não todo o Poder Judiciário;</w:t>
       </w:r>
     </w:p>
     <w:p>
@@ -665,7 +665,7 @@
         </w:numPr>
       </w:pPr>
       <w:r>
-        <w:t xml:space="preserve">mencoes a capacitacao nao sao tratadas automaticamente como lacunas;</w:t>
+        <w:t xml:space="preserve">menções a capacitação não são tratadas automaticamente como lacunas;</w:t>
       </w:r>
     </w:p>
     <w:p>
@@ -677,7 +677,7 @@
         </w:numPr>
       </w:pPr>
       <w:r>
-        <w:t xml:space="preserve">hipoteses de competencia exigem validacao institucional antes de orientar oferta educacional definitiva.</w:t>
+        <w:t xml:space="preserve">hipóteses de competência exigem validação institucional antes de orientar oferta educacional definitiva.</w:t>
       </w:r>
     </w:p>
     <w:bookmarkEnd w:id="14"/>

</xml_diff>